<commit_message>
Manuscript review pass: section-reference convention and claim fixes
- Whole-section cross-references throughout, matching the journal
  sample's convention
- Softened or corrected three empirical claims in the introduction and
  related work (returnee magnitude, county-practice anecdote,
  direction of the e-commerce income-gap finding)
- Grammar fix in the ledger-identity paragraph
- Rebuilt the Word manuscript and re-verified the rendered PDF

Co-Authored-By: Claude Opus 5 <noreply@anthropic.com>
Claude-Session: https://claude.ai/code/session_01MZQ6GENDPYhPqohPF23N4M
</commit_message>
<xml_diff>
--- a/rural-youth-ai/Retention_Aware_Match_Tracing_manuscript.docx
+++ b/rural-youth-ai/Retention_Aware_Match_Tracing_manuscript.docx
@@ -136,7 +136,7 @@
         <w:rPr>
           <w:color w:val="000000"/>
         </w:rPr>
-        <w:t xml:space="preserve">Rural revitalisation runs on young people, and China’s counties now compete for them. National monitoring counts nearly 300 million rural migrant workers, and the cohort returning toward county and village employment has grown into the tens of millions </w:t>
+        <w:t xml:space="preserve">Rural revitalisation runs on young people, and China’s counties now compete for them. National monitoring counts nearly 300 million rural migrant workers </w:t>
       </w:r>
       <w:r>
         <w:rPr>
@@ -148,7 +148,7 @@
         <w:rPr>
           <w:color w:val="000000"/>
         </w:rPr>
-        <w:t xml:space="preserve">. What a returning young person finds is a thin, fragmented market: village posts in modern agriculture, rural e-commerce, agritourism and grassroots governance are scattered across dozens of administrative villages, capacities are small, wages sit below urban expectations, and the match between what a post needs and what a young person can do is judged by whoever happens to administer the scheme. Field studies of returnee entrepreneurship show how sensitive these trajectories are to local embeddedness, prior experience and capability endowments </w:t>
+        <w:t xml:space="preserve">, and county policy now works to draw part of that cohort back toward county and village employment. What a returning young person finds is a thin, fragmented market: village posts in modern agriculture, rural e-commerce, agritourism and grassroots governance are scattered across dozens of administrative villages, capacities are small, wages sit below urban expectations, and the match between what a post needs and what a young person can do is judged by whoever happens to administer the scheme. Field studies of returnee entrepreneurship show how sensitive these trajectories are to local embeddedness, prior experience and capability endowments </w:t>
       </w:r>
       <w:r>
         <w:rPr>
@@ -256,7 +256,7 @@
         <w:rPr>
           <w:color w:val="000000"/>
         </w:rPr>
-        <w:t xml:space="preserve">Three things are wrong with the default way of wiring it. First, the objective is wrong: recommender-style matchers are trained on immediate outcomes — clicks, applications, offer acceptance — whereas the talent chain’s binding constraint is retention. County practice in the Yangtze River Delta reports exactly this failure mode: young people are placed, and then leave, because the placement optimised the placement rate. Second, the models are opaque: a two-tower network scores a pair and the office cannot state why this youth was routed to that post, which matters because an automated employment decision about a public programme is precisely the class of decision that regulation now expects to be explained and audited — the European Union’s AI Act classifies employment-related systems as high-risk </w:t>
+        <w:t xml:space="preserve">Three things are wrong with the default way of wiring it. First, the objective is wrong: recommender-style matchers are trained on immediate outcomes — clicks, applications, offer acceptance — whereas the talent chain’s binding constraint is retention. The predictable failure mode follows: young people are placed, and then leave, because the placement optimised the placement rate. Second, the models are opaque: a two-tower network scores a pair and the office cannot state why this youth was routed to that post, which matters because an automated employment decision about a public programme is precisely the class of decision that regulation now expects to be explained and audited — the European Union’s AI Act classifies employment-related systems as high-risk </w:t>
       </w:r>
       <w:r>
         <w:rPr>
@@ -669,7 +669,7 @@
         <w:rPr>
           <w:color w:val="000000"/>
         </w:rPr>
-        <w:t xml:space="preserve">. The distributional stakes are documented too: rural e-commerce expansion has widened rather than narrowed local income gaps where its gains concentrated </w:t>
+        <w:t xml:space="preserve">. The distributional stakes are documented too: whether rural e-commerce narrows or widens local income gaps has been shown to turn on where its gains concentrate </w:t>
       </w:r>
       <w:r>
         <w:rPr>
@@ -1200,7 +1200,7 @@
         <w:rPr>
           <w:color w:val="000000"/>
         </w:rPr>
-        <w:t xml:space="preserve">. This paper’s contribution to the line is to move the audit from the score to the decision: the checks in Section 4.6 ask whether a trail justifies the allocation actually made, against the alternative actually foregone.</w:t>
+        <w:t xml:space="preserve">. This paper’s contribution to the line is to move the audit from the score to the decision: the checks in Section 4 ask whether a trail justifies the allocation actually made, against the alternative actually foregone.</w:t>
       </w:r>
     </w:p>
     <w:p>
@@ -3973,7 +3973,7 @@
         <w:rPr>
           <w:color w:val="000000"/>
         </w:rPr>
-        <w:t xml:space="preserve"> and here comes free by construction, which is the architectural bet of the paper: Section 6 measures what, if anything, the bet costs in accuracy.</w:t>
+        <w:t xml:space="preserve"> and that comes free by construction, which is the architectural bet of the paper: Section 6 measures what, if anything, the bet costs in accuracy.</w:t>
       </w:r>
     </w:p>
     <w:p>
@@ -5465,7 +5465,7 @@
         <w:rPr>
           <w:color w:val="000000"/>
         </w:rPr>
-        <w:t xml:space="preserve">, the objective of deployed platforms). Section 6.5 traces the frontier and argues the choice of </w:t>
+        <w:t xml:space="preserve">, the objective of deployed platforms). Section 6 traces the frontier and argues the choice of </w:t>
       </w:r>
       <m:oMath>
         <m:r>
@@ -5854,7 +5854,7 @@
         <w:rPr>
           <w:color w:val="000000"/>
         </w:rPr>
-        <w:t xml:space="preserve"> proportional to capacities and the rounded plan used as an assignment. Transport fills every seat by construction; what it gives up, Section 6.3 measures, is stability.</w:t>
+        <w:t xml:space="preserve"> proportional to capacities and the rounded plan used as an assignment. Transport fills every seat by construction; what it gives up, the ablations of Section 6 measure, is stability.</w:t>
       </w:r>
     </w:p>
     <w:p>
@@ -6607,7 +6607,7 @@
         <w:rPr>
           <w:color w:val="000000"/>
         </w:rPr>
-        <w:t xml:space="preserve">: a trail whose largest stated reason, when removed, does not move the decision by its stated share is a rationalisation rather than a reason. For the additive scorer the identity (5) makes all three checks pass mechanically; the point of running them is that the same checks can be applied to any engine whose trails are sampled Shapley attributions, which is how the black-box baselines are audited in Section 6.2.</w:t>
+        <w:t xml:space="preserve">: a trail whose largest stated reason, when removed, does not move the decision by its stated share is a rationalisation rather than a reason. For the additive scorer the identity (5) makes all three checks pass mechanically; the point of running them is that the same checks can be applied to any engine whose trails are sampled Shapley attributions, which is how the black-box baselines are audited in Section 6.</w:t>
       </w:r>
     </w:p>
     <w:p>
@@ -6853,7 +6853,7 @@
         <w:rPr>
           <w:color w:val="000000"/>
         </w:rPr>
-        <w:t xml:space="preserve">. Section 6.5 traces retention against coverage </w:t>
+        <w:t xml:space="preserve">. Section 6 traces retention against coverage </w:t>
       </w:r>
       <m:oMath>
         <m:r>
@@ -7001,7 +7001,7 @@
         <w:rPr>
           <w:color w:val="000000"/>
         </w:rPr>
-        <w:t xml:space="preserve">The ground-truth retention process is built to be unwinnable by specification. Monthly hazards switch regime at month six: in the settling-in regime, hazard is driven by the expectation shortfall, by distance interacted with children, and by a hard threshold that fires when the offered wage falls below 80 per cent of the youth’s expectation; in the consolidation regime, by skill fit, community ties, amenities interacted with children, mentor pairing interacted with fit, and generative-AI literacy on digital posts. Mentorship helps misfits far more than good fits, and none of this structure — the switch, the threshold, the interactions — is in the hypothesis class of any engine below. Acceptance follows a separate two-sided utility with its own noise. A second, structurally different generator (a single smooth logistic hazard with no regimes, no threshold and no interactions) is held out for the validity check of Section 6.6.</w:t>
+        <w:t xml:space="preserve">The ground-truth retention process is built to be unwinnable by specification. Monthly hazards switch regime at month six: in the settling-in regime, hazard is driven by the expectation shortfall, by distance interacted with children, and by a hard threshold that fires when the offered wage falls below 80 per cent of the youth’s expectation; in the consolidation regime, by skill fit, community ties, amenities interacted with children, mentor pairing interacted with fit, and generative-AI literacy on digital posts. Mentorship helps misfits far more than good fits, and none of this structure — the switch, the threshold, the interactions — is in the hypothesis class of any engine below. Acceptance follows a separate two-sided utility with its own noise. A second, structurally different generator (a single smooth logistic hazard with no regimes, no threshold and no interactions) is held out for the validity checks of Section 6.</w:t>
       </w:r>
     </w:p>
     <w:p>
@@ -7241,7 +7241,7 @@
         <w:rPr>
           <w:color w:val="000000"/>
         </w:rPr>
-        <w:t xml:space="preserve">Deployment metrics are computed exactly under the generator: offer acceptance, 24-month retention among formed matches, and the headline stay-yield per 100 offers — the expected number of offers that both form and survive the horizon, the objective in (1) scaled to a round of one hundred. Skill fit of assigned pairs, the blocking-pair rate of (2) estimated on sampled pairs against the retention-priority preferences, and an assignment-parity ratio — the assignment rate of youth with college education and above over that of the rest — complete the deployment picture. Audit metrics follow Section 4.6: reconstruction residual as a share of the score difference, and pass rates of the sufficiency, minimality and counterfactual-flip checks, computed on samples of assigned matches. Ranking quality of each scorer is summarised by pairwise AUC against true retention on random pairs. All results aggregate 20 independent market replications (audits over 8), reported as mean and standard deviation across markets.</w:t>
+        <w:t xml:space="preserve">Deployment metrics are computed exactly under the generator: offer acceptance, 24-month retention among formed matches, and the headline stay-yield per 100 offers — the expected number of offers that both form and survive the horizon, the objective in (1) scaled to a round of one hundred. Skill fit of assigned pairs, the blocking-pair rate of (2) estimated on sampled pairs against the retention-priority preferences, and an assignment-parity ratio — the assignment rate of youth with college education and above over that of the rest — complete the deployment picture. Audit metrics follow the checks of Section 4: reconstruction residual as a share of the score difference, and pass rates of the sufficiency, minimality and counterfactual-flip checks, computed on samples of assigned matches. Ranking quality of each scorer is summarised by pairwise AUC against true retention on random pairs. All results aggregate 20 independent market replications (audits over 8), reported as mean and standard deviation across markets.</w:t>
       </w:r>
     </w:p>
     <w:p>
@@ -9160,7 +9160,7 @@
         <w:rPr>
           <w:color w:val="000000"/>
         </w:rPr>
-        <w:t xml:space="preserve">Two structural lessons sit inside the table. First, the objective matters exactly as the design argued: the interpretable acceptance matcher — RAMT’s machinery with the objective swapped — fills slightly more seats (acceptance 0.511 (0.013) against 0.465 (0.022)) but holds them less well (retention 0.570 (0.008) against 0.605 (0.010)); on the stay-yield product the two land within one standard deviation of each other (29.13 (1.01) against 28.13 (1.57)), because forming more matches and keeping each formed match longer trade off almost exactly under this wage structure. The mixing dial of Section 6.5 spans the entire frontier between the two objectives, so where a county sits on it is a published policy parameter, not a property of the engine. Second, the allocator matters as much as the scorer: the boosted-tree scorer is the best ranker in the pool (pairwise AUC 0.947 against 0.864 for the additive scorer) yet deployed greedily it yields only 19.06 (2.67), because greedy filling spends the best posts on whoever is processed first and leaves a 0.252 blocking-pair rate behind. A better prediction, allocated worse, loses; the ablations return to this.</w:t>
+        <w:t xml:space="preserve">Two structural lessons sit inside the table. First, the objective matters exactly as the design argued: the interpretable acceptance matcher — RAMT’s machinery with the objective swapped — fills slightly more seats (acceptance 0.511 (0.013) against 0.465 (0.022)) but holds them less well (retention 0.570 (0.008) against 0.605 (0.010)); on the stay-yield product the two land within one standard deviation of each other (29.13 (1.01) against 28.13 (1.57)), because forming more matches and keeping each formed match longer trade off almost exactly under this wage structure. The mixing dial of Section 6 spans the entire frontier between the two objectives, so where a county sits on it is a published policy parameter, not a property of the engine. Second, the allocator matters as much as the scorer: the boosted-tree scorer is the best ranker in the pool (pairwise AUC 0.947 against 0.864 for the additive scorer) yet deployed greedily it yields only 19.06 (2.67), because greedy filling spends the best posts on whoever is processed first and leaves a 0.252 blocking-pair rate behind. A better prediction, allocated worse, loses; the ablations return to this.</w:t>
       </w:r>
     </w:p>
     <w:p>
@@ -9193,7 +9193,7 @@
         <w:rPr>
           <w:color w:val="000000"/>
         </w:rPr>
-        <w:t xml:space="preserve">Table 2 applies the decision-level audits of Section 4.6 to every engine that ships a trail. For RAMT the trail is the ledger; for the black-box engines it is sampled Shapley attribution over the same features, with the same checks applied to the same decisions. The reconstruction residual is deliberately uninformative: the ledger reconstructs its score because (5) is an identity, and a permutation-sampled Shapley trail also telescopes exactly to the score difference, so every row reports zero and summing to the decision cannot separate a trail that is the computation from one that merely balances. The informative columns are the decision checks. The ledger passes the counterfactual-flip check at 1.000; the platform matcher’s Shapley trail passes at 0.188 and the boosted retention scorer’s at 0.360 — trails that read plausibly but, when their largest stated reason is removed, do not move the decision by the stated amount, because the underlying functions are not additive and the attribution pretends they are. An office that acted on such a trail — waiving a distance concern here, a wage top-up there — would be acting on reasons the model does not actually have.</w:t>
+        <w:t xml:space="preserve">Table 2 applies the decision-level audits of Section 4 to every engine that ships a trail. For RAMT the trail is the ledger; for the black-box engines it is sampled Shapley attribution over the same features, with the same checks applied to the same decisions. The reconstruction residual is deliberately uninformative: the ledger reconstructs its score because (5) is an identity, and a permutation-sampled Shapley trail also telescopes exactly to the score difference, so every row reports zero and summing to the decision cannot separate a trail that is the computation from one that merely balances. The informative columns are the decision checks. The ledger passes the counterfactual-flip check at 1.000; the platform matcher’s Shapley trail passes at 0.188 and the boosted retention scorer’s at 0.360 — trails that read plausibly but, when their largest stated reason is removed, do not move the decision by the stated amount, because the underlying functions are not additive and the attribution pretends they are. An office that acted on such a trail — waiving a distance concern here, a wage top-up there — would be acting on reasons the model does not actually have.</w:t>
       </w:r>
     </w:p>
     <w:p>
@@ -12107,7 +12107,7 @@
         <w:rPr>
           <w:color w:val="000000"/>
         </w:rPr>
-        <w:t xml:space="preserve">Two checks probe whether the conclusions are artefacts of the simulator. First, the entire evaluation was re-run under the held-out generator of Section 5.1 — a single smooth logistic hazard with none of the regime, threshold or interaction structure the engines could not represent. Table 4 shows the engine ordering is preserved essentially intact (rank correlation 1.00 across the seven engines), with the two interpretable deferred-acceptance engines again at the top of the learned pool; the acceptance-trained variant gains the most under the smooth generator, which removes the hard wage-expectation cliff that made early churn expensive, and the design conclusions — allocator first, objective as a policy dial, audits only from the ledger — do not depend on which wrong model of the world generated the data. Second, the generative-AI profiling layer was corrupted by replacing each extracted field, with probability rising to certainty, by the corresponding field of another randomly drawn profile — the plausible-but-wrong error an extraction pipeline actually makes. The response is a threshold, not a slope. Stay-yield is essentially flat through 40 per cent field error (28.42 clean against 27.86 at 0.4), because the additive scorer pools fifteen fields and deferred acceptance needs only the relative order of candidates to survive; but as corruption approaches totality RAMT falls to 21.89 — the level of the uncoordinated queue (22.43) — while the acceptance matcher barely moves (29.27 to 29.11), because acceptance is driven by administrative fields the profiler does not have to extract — distance, wage, housing — whereas retention lives in exactly the fields it must: skills, expectations, ties. The entire advantage of retention-aware matching is purchased by the extraction layer, and a county that does not audit the profiler with the same seriousness as the matcher forfeits precisely that advantage — a concrete reading of the transparency duties the generative-AI measures already impose </w:t>
+        <w:t xml:space="preserve">Two checks probe whether the conclusions are artefacts of the simulator. First, the entire evaluation was re-run under the held-out generator of Section 5 — a single smooth logistic hazard with none of the regime, threshold or interaction structure the engines could not represent. Table 4 shows the engine ordering is preserved essentially intact (rank correlation 1.00 across the seven engines), with the two interpretable deferred-acceptance engines again at the top of the learned pool; the acceptance-trained variant gains the most under the smooth generator, which removes the hard wage-expectation cliff that made early churn expensive, and the design conclusions — allocator first, objective as a policy dial, audits only from the ledger — do not depend on which wrong model of the world generated the data. Second, the generative-AI profiling layer was corrupted by replacing each extracted field, with probability rising to certainty, by the corresponding field of another randomly drawn profile — the plausible-but-wrong error an extraction pipeline actually makes. The response is a threshold, not a slope. Stay-yield is essentially flat through 40 per cent field error (28.42 clean against 27.86 at 0.4), because the additive scorer pools fifteen fields and deferred acceptance needs only the relative order of candidates to survive; but as corruption approaches totality RAMT falls to 21.89 — the level of the uncoordinated queue (22.43) — while the acceptance matcher barely moves (29.27 to 29.11), because acceptance is driven by administrative fields the profiler does not have to extract — distance, wage, housing — whereas retention lives in exactly the fields it must: skills, expectations, ties. The entire advantage of retention-aware matching is purchased by the extraction layer, and a county that does not audit the profiler with the same seriousness as the matcher forfeits precisely that advantage — a concrete reading of the transparency duties the generative-AI measures already impose </w:t>
       </w:r>
       <w:r>
         <w:rPr>
@@ -13110,7 +13110,7 @@
         <w:rPr>
           <w:color w:val="000000"/>
         </w:rPr>
-        <w:t xml:space="preserve"> — with the profiling caveats of Section 6.6 — would let the stability guarantee bind to preferences the young people actually state.</w:t>
+        <w:t xml:space="preserve"> — with the profiling caveats of Section 6 — would let the stability guarantee bind to preferences the young people actually state.</w:t>
       </w:r>
     </w:p>
     <w:p>

</xml_diff>

<commit_message>
Figures: route the feedback loop along the bottom, clear the ledger totals box, shorten all figure captions
Co-Authored-By: Claude Fable 5 <noreply@anthropic.com>
Claude-Session: https://claude.ai/code/session_01MZQ6GENDPYhPqohPF23N4M
</commit_message>
<xml_diff>
--- a/rural-youth-ai/Retention_Aware_Match_Tracing_manuscript.docx
+++ b/rural-youth-ai/Retention_Aware_Match_Tracing_manuscript.docx
@@ -2902,7 +2902,7 @@
         <w:rPr>
           <w:color w:val="000000"/>
         </w:rPr>
-        <w:t xml:space="preserve">Figure 1. The deployed pipeline. A generative-AI profiling layer extracts structured youth and post profiles from free-form materials; RAMT scores every feasible pair on predicted retention, allocates under capacity constraints, and attaches to every offer an exact evidence ledger, an uncertainty flag routing low-margin cases to a case worker, and the audited outcome record that feeds the next round of training.</w:t>
+        <w:t xml:space="preserve">Figure 1. The deployed pipeline. The generative-AI profiling layer feeds RAMT, whose offers carry evidence ledgers and abstentions; observed acceptance and retention feed the next round of training.</w:t>
       </w:r>
     </w:p>
     <w:p>
@@ -2957,7 +2957,7 @@
         <w:rPr>
           <w:color w:val="000000"/>
         </w:rPr>
-        <w:t xml:space="preserve">Figure 2. The RAMT scoring and allocation architecture. A fixed 15-feature pair ledger feeds per-feature additive spline contributions that sum exactly to the pair score; a discrete-time retention hazard with regime intercepts and an acceptance head are mixed by the policy dial α; capacity-constrained deferred acceptance produces the offer list, and a bootstrap ensemble margin routes uncertain matches to human review.</w:t>
+        <w:t xml:space="preserve">Figure 2. The RAMT architecture: additive spline scoring over the pre-registered feature ledger, retention and acceptance heads mixed by the dial α, capacity-constrained deferred acceptance, and ensemble-margin abstention.</w:t>
       </w:r>
     </w:p>
     <w:p>
@@ -10240,7 +10240,7 @@
         <w:rPr>
           <w:color w:val="000000"/>
         </w:rPr>
-        <w:t xml:space="preserve">Figure 3. The exact evidence ledger for one median-margin match (market replication 1). Bars give each pair feature’s signed contribution to the score difference between the offered post and the best alternative; filled bars favour the offered post and open bars favour the alternative. The ten largest contributions are shown and the full ledger sums to the score difference with zero residual.</w:t>
+        <w:t xml:space="preserve">Figure 3. The exact evidence ledger for one median-margin match (market replication 1): the ten largest signed contributions to the score difference between the offered post and the best alternative. Filled bars favour the offered post.</w:t>
       </w:r>
     </w:p>
     <w:p>
@@ -12026,7 +12026,7 @@
         <w:rPr>
           <w:color w:val="000000"/>
         </w:rPr>
-        <w:t xml:space="preserve">Figure 4. The two policy dials. (a) Acceptance, 24-month retention among formed matches, and stay-yield per 100 offers as the objective mixing weight α moves from pure retention (α = 0) to pure acceptance (α = 1); means over 10 market replications. (b) 24-month retention among automatically approved matches as the automated share of decisions rises from one half to full automation, with one standard deviation across replications; the remainder is routed to a case worker by the bootstrap ensemble margin.</w:t>
+        <w:t xml:space="preserve">Figure 4. The two policy dials. (a) Acceptance, retention and stay-yield against the mixing weight α (means over 10 market replications). (b) 24-month retention among auto-approved matches against automated coverage, with one standard deviation across replications.</w:t>
       </w:r>
     </w:p>
     <w:p>

</xml_diff>